<commit_message>
Rewrite proposal using the official ACML template
</commit_message>
<xml_diff>
--- a/output/docx/proposal.docx
+++ b/output/docx/proposal.docx
@@ -8,50 +8,44 @@
         <w:jc w:val="center"/>
       </w:pPr>
       <w:r>
-        <w:t>Robust Multi Object Segmentation and Tracking with SAM 3</w:t>
+        <w:t>Robust Multi-Object Segmentation and Tracking</w:t>
+      </w:r>
+    </w:p>
+    <w:p>
+      <w:r>
+        <w:rPr>
+          <w:b/>
+        </w:rPr>
+        <w:t>Jingdi Wu</w:t>
+      </w:r>
+    </w:p>
+    <w:p>
+      <w:r>
+        <w:rPr>
+          <w:b/>
+        </w:rPr>
+        <w:t>Yupu Guo</w:t>
+      </w:r>
+    </w:p>
+    <w:p>
+      <w:r>
+        <w:rPr>
+          <w:b/>
+        </w:rPr>
+        <w:t>Christina Ross</w:t>
       </w:r>
     </w:p>
     <w:p>
       <w:pPr>
-        <w:spacing w:after="40"/>
-        <w:jc w:val="center"/>
-      </w:pPr>
-      <w:r>
-        <w:t>Jingdi Wu, Yupu Guo, Christina Ross</w:t>
-      </w:r>
-    </w:p>
-    <w:p>
-      <w:pPr>
-        <w:jc w:val="center"/>
+        <w:spacing w:after="360"/>
       </w:pPr>
       <w:r>
         <w:rPr>
-          <w:sz w:val="18"/>
+          <w:i/>
+          <w:sz w:val="20"/>
         </w:rPr>
-        <w:t>Rutgers University | CS550 Massive Data Mining | Fall 2026</w:t>
+        <w:t>Rutgers University, CS550 Massive Data Mining</w:t>
       </w:r>
-    </w:p>
-    <w:p>
-      <w:pPr>
-        <w:spacing w:after="200"/>
-        <w:jc w:val="center"/>
-      </w:pPr>
-      <w:r>
-        <w:rPr>
-          <w:sz w:val="18"/>
-        </w:rPr>
-        <w:t>Project proposal | October 7 2026</w:t>
-      </w:r>
-    </w:p>
-    <w:p>
-      <w:pPr>
-        <w:sectPr>
-          <w:pgSz w:w="12240" w:h="15840"/>
-          <w:pgMar w:top="1080" w:right="1080" w:bottom="1800" w:left="1080" w:header="360" w:footer="360" w:gutter="0"/>
-          <w:cols w:space="540" w:num="1" w:equalWidth="1"/>
-          <w:docGrid w:linePitch="360"/>
-        </w:sectPr>
-      </w:pPr>
     </w:p>
     <w:p>
       <w:pPr>
@@ -65,12 +59,33 @@
     </w:p>
     <w:p>
       <w:pPr>
-        <w:spacing w:after="60"/>
-        <w:ind w:left="173" w:right="173"/>
+        <w:spacing w:after="0"/>
+        <w:ind w:left="400" w:right="400"/>
         <w:jc w:val="both"/>
       </w:pPr>
       <w:r>
-        <w:t>We propose a controlled study of automatic instance segmentation and tracking across diverse object categories, including people and animals. We will compare pretrained SAM 3 with YOLO segmentation coupled to ByteTrack and BoT-SORT, and test whether limited supervised adaptation improves mask accuracy, identity continuity, and robustness. SAM 3 adaptation will target its image and detection stage while retaining the temporal tracker, subject to a GPU feasibility pilot. A smaller YOLO fine-tuning experiment provides a fallback. The study will use annotated videos, fixed evaluation splits, standard metrics, and paired robustness tests. Deliverables include reproducible code, an eight-page report excluding references, and an in-class presentation.</w:t>
+        <w:rPr>
+          <w:sz w:val="20"/>
+        </w:rPr>
+        <w:t>We compare automatic segmentation and tracking across people, animals, and vehicles using SAM 3 and YOLO with ByteTrack or BoT-SORT. We test whether adaptation improves mask accuracy, identity continuity, and robustness on annotated, sequence-disjoint videos. SAM 3 image-stage fine-tuning requires a GPU and mask-training pilot; YOLO adaptation provides a fallback. Deliverables are reproducible code, an eight-page report excluding references, and a presentation.</w:t>
+      </w:r>
+    </w:p>
+    <w:p>
+      <w:pPr>
+        <w:ind w:left="400" w:right="400"/>
+      </w:pPr>
+      <w:r>
+        <w:rPr>
+          <w:b/>
+          <w:sz w:val="20"/>
+        </w:rPr>
+        <w:t xml:space="preserve">Keywords: </w:t>
+      </w:r>
+      <w:r>
+        <w:rPr>
+          <w:sz w:val="20"/>
+        </w:rPr>
+        <w:t>video instance segmentation; multi-object tracking; fine-tuning; robustness</w:t>
       </w:r>
     </w:p>
     <w:p>
@@ -78,25 +93,16 @@
         <w:pStyle w:val="Heading1"/>
       </w:pPr>
       <w:r>
-        <w:t>1 Motivation and Research Questions</w:t>
+        <w:t>1. Introduction</w:t>
       </w:r>
     </w:p>
     <w:p>
       <w:pPr>
-        <w:spacing w:after="60"/>
+        <w:spacing w:after="0"/>
         <w:jc w:val="both"/>
       </w:pPr>
       <w:r>
-        <w:t>Objects in videos change position, appearance, and visibility. Accurate outlines in individual frames do not guarantee that the same object keeps its identity through occlusion. We will examine these interacting errors across several categories, rather than treating vehicle tracking as the only application.</w:t>
-      </w:r>
-    </w:p>
-    <w:p>
-      <w:pPr>
-        <w:spacing w:after="60"/>
-        <w:jc w:val="both"/>
-      </w:pPr>
-      <w:r>
-        <w:t>Our questions are: (RQ1) How do SAM 3 and lightweight segmentation-plus-association pipelines trade mask accuracy, identity continuity, and computation? (RQ2) Does dataset-specific fine-tuning improve those measures on unseen videos? (RQ3) How sensitive are the methods to image degradation and challenging motion? We hypothesize that adaptation improves segmentation, but association may remain a bottleneck. This is a hypothesis to test, not an expected result presented as fact.</w:t>
+        <w:t>Accurate masks do not ensure identity continuity through motion or occlusion. We ask how methods trade accuracy, association, and computation; whether adaptation improves unseen-video performance; and how degradation affects these measures. We hypothesize that adaptation improves masks while association may remain a bottleneck.</w:t>
       </w:r>
     </w:p>
     <w:p>
@@ -104,34 +110,25 @@
         <w:pStyle w:val="Heading1"/>
       </w:pPr>
       <w:r>
-        <w:t>2 Methods and Adaptation</w:t>
+        <w:t>2. Methods and Adaptation</w:t>
       </w:r>
     </w:p>
     <w:p>
       <w:pPr>
-        <w:spacing w:after="60"/>
+        <w:spacing w:after="0"/>
         <w:jc w:val="both"/>
       </w:pPr>
       <w:r>
-        <w:t>SAM 3 detects and segments instances matching a text concept and tracks them through video [1]. We will use fixed category names without manual test-time corrections. YOLO predicts per-frame masks; ByteTrack and BoT-SORT associate detections into tracks [2-4]. The core pretrained comparison comprises SAM 3, YOLO11s-seg with ByteTrack, and the same YOLO checkpoint with BoT-SORT. We will document camera compensation and appearance matching settings. Each method must output instance masks, category labels, confidence scores, and persistent identities.</w:t>
+        <w:t>SAM 3 tracks instances matching a text concept (Meta AI, 2026). Baselines use YOLO11s-seg with ByteTrack or BoT-SORT (Ultralytics, 2026; Zhang et al., 2022; Aharon et al., 2022). Each outputs masks, categories, confidence, and IDs. SAM 3 uses fixed prompts without manual corrections; separate concept runs use namespaced IDs and validation-selected conflict handling. Timing includes every run.</w:t>
       </w:r>
     </w:p>
     <w:p>
       <w:pPr>
-        <w:spacing w:after="60"/>
+        <w:spacing w:after="0"/>
         <w:jc w:val="both"/>
       </w:pPr>
       <w:r>
-        <w:t>Fine-tuning will use only training frames and instance masks. The official SAM 3 training guide documents single-GPU execution, but supplies image-stage examples rather than a ready end-to-end video-tracker training recipe [1]. Its example configuration disables segmentation by default; we must enable and verify mask supervision. If the pilot succeeds, we will adapt the image detector and shared features, preserve tracker weights, and verify checkpoint loading into the video pipeline. We will compare the same SAM 3 variant before and after adaptation. This experiment measures the effect of image-stage adaptation on video performance.</w:t>
-      </w:r>
-    </w:p>
-    <w:p>
-      <w:pPr>
-        <w:spacing w:after="60"/>
-        <w:jc w:val="both"/>
-      </w:pPr>
-      <w:r>
-        <w:t>If SAM 3 adaptation exceeds the available memory, allocation, or integration budget, we will fine-tune YOLO and evaluate both association methods. Tracker threshold adjustment is configuration tuning, not learned-weight fine-tuning. SAM 3 remains a pretrained comparator if inference fits. Video-tracker training and custom LoRA are outside the planned scope.</w:t>
+        <w:t>If feasible, we adapt SAM 3's image detector and shared features, holding its tracker fixed. Its example configuration disables segmentation; mask supervision and checkpoint transfer must be verified. Otherwise, we fine-tune YOLO with both trackers, retaining pretrained SAM 3 when inference fits. Threshold selection is configuration tuning. Custom LoRA and tracker training are outside scope.</w:t>
       </w:r>
     </w:p>
     <w:p>
@@ -139,25 +136,16 @@
         <w:pStyle w:val="Heading1"/>
       </w:pPr>
       <w:r>
-        <w:t>3 Data and Fair Comparison</w:t>
+        <w:t>3. Data and Experimental Protocol</w:t>
       </w:r>
     </w:p>
     <w:p>
       <w:pPr>
-        <w:spacing w:after="60"/>
+        <w:spacing w:after="0"/>
         <w:jc w:val="both"/>
       </w:pPr>
       <w:r>
-        <w:t>We will use a manageable subset of YouTube-VIS 2021, which provides masks and identities for multiple object categories [5]. The initial target is up to 200 labeled videos spanning five categories shared with YOLO, such as person, dog, cat, horse, and car. Final class and instance counts will be reported after data inspection. We will partition labeled training videos into 60 percent training, 20 percent validation, and 20 percent held-out evaluation, keeping complete source videos together and maintaining category coverage.</w:t>
-      </w:r>
-    </w:p>
-    <w:p>
-      <w:pPr>
-        <w:spacing w:after="60"/>
-        <w:jc w:val="both"/>
-      </w:pPr>
-      <w:r>
-        <w:t>A single versioned split manifest will control all experiments. Training-frame sampling will reduce near-duplicate examples; evaluation will retain the annotated temporal sequence. We will map category definitions consistently and follow annotation ignore rules. Test masks will be used only for evaluation. SAM 3 text prompts will use fixed category names, not ground-truth boxes or masks. We will record native preprocessing, checkpoint versions, and upstream commits. Selected categories define the evaluated recognition task; arbitrary unseen-category performance is a separate question.</w:t>
+        <w:t>We target up to 200 labeled YouTube-VIS 2021 training videos covering person, dog, cat, horse, and car (Yang et al., 2019), split 60/20/20 by complete source video with category coverage. Training uses sampled frames and masks; evaluation retains annotated sequences. We freeze splits, category mappings, prompts, checkpoints, preprocessing, and tracker settings. Test annotations serve only scoring; annotation limitations and known pretraining overlap will be disclosed.</w:t>
       </w:r>
     </w:p>
     <w:p>
@@ -165,25 +153,25 @@
         <w:pStyle w:val="Heading1"/>
       </w:pPr>
       <w:r>
-        <w:t>4 Evaluation and Stability</w:t>
+        <w:t>4. Evaluation and Robustness</w:t>
       </w:r>
     </w:p>
     <w:p>
       <w:pPr>
-        <w:spacing w:after="60"/>
+        <w:spacing w:after="0"/>
         <w:jc w:val="both"/>
       </w:pPr>
       <w:r>
-        <w:t>The primary score is video AP on our held-out subset using the official YouTube-VIS evaluator, measuring classified mask tracks across frames [5]. Per-frame mask AP diagnoses segmentation. Mask-based HOTA, its detection/association components, and ID switches require a validated conversion and matching protocol [6]. These are supplementary analyses, not challenge results. SAM 3 will run each category concept separately with namespaced IDs; validation will fix overlap conflicts and track-confidence aggregation. Timing includes all category runs, decoding, preprocessing, inference, and association; we record hardware, precision, resolution, and peak GPU memory.</w:t>
+        <w:t>Primary evaluation is held-out video AP using the official YouTube-VIS evaluator. Frame mask AP diagnoses segmentation. Supplementary mask HOTA, DetA, AssA, and ID switches require validated annotation conversion and matching (Luiten et al., 2020). These are internal subset results. Validation fixes track-confidence aggregation.</w:t>
       </w:r>
     </w:p>
     <w:p>
       <w:pPr>
-        <w:spacing w:after="60"/>
+        <w:spacing w:after="0"/>
         <w:jc w:val="both"/>
       </w:pPr>
       <w:r>
-        <w:t>We define stability as identity continuity and resistance to input degradation. Paired tests will apply predefined mild blur, brightness changes, and JPEG compression to held-out frames without changing geometry. We will report each method's score drop from clean input, with results by category and, where enough examples exist, object size and occlusion. Natural disappearance and reappearance cases will support qualitative recovery analysis. Raw overlap between adjacent predicted masks is not a stability score because genuine motion changes mask position and shape. Bootstrap intervals will resample whole videos; multiple training seeds will be used if the allocation permits.</w:t>
+        <w:t>Paired blur, brightness, and JPEG tests preserve geometry. We report score drops, identity continuity, occlusion failures, FPS, and peak GPU memory, recording hardware, precision, resolutions, and timing scope. Uncertainty resamples videos; repeated seeds depend on budget. Adjacent-mask overlap cannot measure stability because objects move.</w:t>
       </w:r>
     </w:p>
     <w:p>
@@ -191,34 +179,25 @@
         <w:pStyle w:val="Heading1"/>
       </w:pPr>
       <w:r>
-        <w:t>5 Compute Feasibility and Work Plan</w:t>
+        <w:t>5. Feasibility and Work Plan</w:t>
       </w:r>
     </w:p>
     <w:p>
       <w:pPr>
-        <w:spacing w:after="60"/>
+        <w:spacing w:after="0"/>
         <w:jc w:val="both"/>
       </w:pPr>
       <w:r>
-        <w:t>Lab GPU availability is not yet confirmed. The official SAM 3 guide allows local single-GPU training but does not specify a universal VRAM minimum or duration [1]. We will first record GPU memory, CUDA compatibility, storage, and job limits; obtain checkpoint access; run approximately 100 frames of video inference; and run at least 20 optimizer steps with batch size one and mask supervision. The pilot must complete within the allocation with memory headroom, nonzero mask loss, finite gradients, changed intended parameters, and a correctly reloaded checkpoint. Measured throughput will determine the training budget. No GPU-hour estimate will be treated as established before this pilot.</w:t>
+        <w:t>Hardware is unconfirmed. SAM 3 supports single-GPU image-stage training without a universal memory guarantee. A 100-frame inference and 20-step mask-training pilot at batch size one must verify memory headroom, finite gradients, changed intended parameters, and reloaded weights. Measured throughput sets the training budget.</w:t>
       </w:r>
     </w:p>
     <w:p>
       <w:pPr>
-        <w:spacing w:after="60"/>
+        <w:spacing w:after="0"/>
         <w:jc w:val="both"/>
       </w:pPr>
       <w:r>
-        <w:t>Weeks 1-2 will finalize the proposal, dataset split, environment, pretrained baselines, and evaluator. Weeks 3-4 will complete the compute pilot, adaptation, and validation. Week 5 will freeze settings and run held-out comparisons. Week 6 will analyze robustness and failures. Weeks 7-8 will produce and revise the report, release reproducible configurations, and prepare the presentation. If the pilot fails, the YOLO adaptation path will begin by the end of week 3.</w:t>
-      </w:r>
-    </w:p>
-    <w:p>
-      <w:pPr>
-        <w:spacing w:after="60"/>
-        <w:jc w:val="both"/>
-      </w:pPr>
-      <w:r>
-        <w:t>The report will cover related work, data and methods, quantitative comparisons, failure cases, and limitations. We will release reproducible scripts, configurations, split manifests, and result schemas. Data and weights remain external; improvement claims require measured evidence.</w:t>
+        <w:t>Weeks 1-2 establish data, baselines, and evaluation; weeks 3-4 cover the pilot and adaptation; week 5 runs frozen held-out comparisons; week 6 analyzes robustness; weeks 7-8 prepare the report and presentation. YOLO fallback begins by week 3. Improvement claims require measured evidence.</w:t>
       </w:r>
     </w:p>
     <w:p>
@@ -231,46 +210,20 @@
     </w:p>
     <w:p>
       <w:pPr>
-        <w:spacing w:after="40"/>
-        <w:ind w:left="230" w:hanging="230"/>
+        <w:spacing w:after="80"/>
+        <w:ind w:left="220" w:hanging="220"/>
       </w:pPr>
       <w:r>
-        <w:t xml:space="preserve">1. Meta AI. SAM 3 code, model documentation, and training guide. 2026. </w:t>
-      </w:r>
-      <w:hyperlink r:id="rId9">
-        <w:r>
-          <w:rPr>
-            <w:rFonts w:ascii="Times New Roman" w:hAnsi="Times New Roman"/>
-            <w:color w:val="000000"/>
-            <w:sz w:val="20"/>
-          </w:rPr>
-          <w:t>Repository</w:t>
-        </w:r>
-      </w:hyperlink>
-      <w:r>
-        <w:t xml:space="preserve">; </w:t>
+        <w:t xml:space="preserve">Aharon, Orfaig, and Bobrovsky. BoT-SORT: Robust Associations Multi-Pedestrian Tracking. 2022. </w:t>
       </w:r>
       <w:hyperlink r:id="rId10">
         <w:r>
           <w:rPr>
             <w:rFonts w:ascii="Times New Roman" w:hAnsi="Times New Roman"/>
             <w:color w:val="000000"/>
-            <w:sz w:val="20"/>
+            <w:sz w:val="22"/>
           </w:rPr>
-          <w:t>training guide</w:t>
-        </w:r>
-      </w:hyperlink>
-      <w:r>
-        <w:t xml:space="preserve">; </w:t>
-      </w:r>
-      <w:hyperlink r:id="rId11">
-        <w:r>
-          <w:rPr>
-            <w:rFonts w:ascii="Times New Roman" w:hAnsi="Times New Roman"/>
-            <w:color w:val="000000"/>
-            <w:sz w:val="20"/>
-          </w:rPr>
-          <w:t>example configuration</w:t>
+          <w:t>Paper</w:t>
         </w:r>
       </w:hyperlink>
       <w:r>
@@ -279,18 +232,88 @@
     </w:p>
     <w:p>
       <w:pPr>
-        <w:spacing w:after="40"/>
-        <w:ind w:left="230" w:hanging="230"/>
+        <w:spacing w:after="80"/>
+        <w:ind w:left="220" w:hanging="220"/>
       </w:pPr>
       <w:r>
-        <w:t xml:space="preserve">2. Ultralytics. Instance segmentation and multi-object tracking documentation. 2026. </w:t>
+        <w:t xml:space="preserve">Luiten et al. HOTA: A Higher Order Metric for Evaluating Multi-Object Tracking. IJCV, 2020. </w:t>
+      </w:r>
+      <w:hyperlink r:id="rId11">
+        <w:r>
+          <w:rPr>
+            <w:rFonts w:ascii="Times New Roman" w:hAnsi="Times New Roman"/>
+            <w:color w:val="000000"/>
+            <w:sz w:val="22"/>
+          </w:rPr>
+          <w:t>Paper</w:t>
+        </w:r>
+      </w:hyperlink>
+      <w:r>
+        <w:t xml:space="preserve">; </w:t>
       </w:r>
       <w:hyperlink r:id="rId12">
         <w:r>
           <w:rPr>
             <w:rFonts w:ascii="Times New Roman" w:hAnsi="Times New Roman"/>
             <w:color w:val="000000"/>
-            <w:sz w:val="20"/>
+            <w:sz w:val="22"/>
+          </w:rPr>
+          <w:t>implementation</w:t>
+        </w:r>
+      </w:hyperlink>
+      <w:r>
+        <w:t>.</w:t>
+      </w:r>
+    </w:p>
+    <w:p>
+      <w:pPr>
+        <w:spacing w:after="80"/>
+        <w:ind w:left="220" w:hanging="220"/>
+      </w:pPr>
+      <w:r>
+        <w:t xml:space="preserve">Meta AI. SAM 3 model and training documentation. 2026. </w:t>
+      </w:r>
+      <w:hyperlink r:id="rId13">
+        <w:r>
+          <w:rPr>
+            <w:rFonts w:ascii="Times New Roman" w:hAnsi="Times New Roman"/>
+            <w:color w:val="000000"/>
+            <w:sz w:val="22"/>
+          </w:rPr>
+          <w:t>Repository</w:t>
+        </w:r>
+      </w:hyperlink>
+      <w:r>
+        <w:t xml:space="preserve">; </w:t>
+      </w:r>
+      <w:hyperlink r:id="rId14">
+        <w:r>
+          <w:rPr>
+            <w:rFonts w:ascii="Times New Roman" w:hAnsi="Times New Roman"/>
+            <w:color w:val="000000"/>
+            <w:sz w:val="22"/>
+          </w:rPr>
+          <w:t>training guide</w:t>
+        </w:r>
+      </w:hyperlink>
+      <w:r>
+        <w:t>.</w:t>
+      </w:r>
+    </w:p>
+    <w:p>
+      <w:pPr>
+        <w:spacing w:after="80"/>
+        <w:ind w:left="220" w:hanging="220"/>
+      </w:pPr>
+      <w:r>
+        <w:t xml:space="preserve">Ultralytics. Segmentation and tracking documentation. 2026. </w:t>
+      </w:r>
+      <w:hyperlink r:id="rId15">
+        <w:r>
+          <w:rPr>
+            <w:rFonts w:ascii="Times New Roman" w:hAnsi="Times New Roman"/>
+            <w:color w:val="000000"/>
+            <w:sz w:val="22"/>
           </w:rPr>
           <w:t>Segmentation</w:t>
         </w:r>
@@ -298,12 +321,12 @@
       <w:r>
         <w:t xml:space="preserve">; </w:t>
       </w:r>
-      <w:hyperlink r:id="rId13">
+      <w:hyperlink r:id="rId16">
         <w:r>
           <w:rPr>
             <w:rFonts w:ascii="Times New Roman" w:hAnsi="Times New Roman"/>
             <w:color w:val="000000"/>
-            <w:sz w:val="20"/>
+            <w:sz w:val="22"/>
           </w:rPr>
           <w:t>tracking</w:t>
         </w:r>
@@ -314,18 +337,40 @@
     </w:p>
     <w:p>
       <w:pPr>
-        <w:spacing w:after="40"/>
-        <w:ind w:left="230" w:hanging="230"/>
+        <w:spacing w:after="80"/>
+        <w:ind w:left="220" w:hanging="220"/>
       </w:pPr>
       <w:r>
-        <w:t xml:space="preserve">3. Zhang et al. ByteTrack Multi-Object Tracking by Associating Every Detection Box. ECCV 2022. </w:t>
+        <w:t xml:space="preserve">Yang, Fan, and Xu. Video Instance Segmentation. ICCV, 2019. </w:t>
       </w:r>
-      <w:hyperlink r:id="rId14">
+      <w:hyperlink r:id="rId17">
         <w:r>
           <w:rPr>
             <w:rFonts w:ascii="Times New Roman" w:hAnsi="Times New Roman"/>
             <w:color w:val="000000"/>
-            <w:sz w:val="20"/>
+            <w:sz w:val="22"/>
+          </w:rPr>
+          <w:t>YouTube-VIS dataset</w:t>
+        </w:r>
+      </w:hyperlink>
+      <w:r>
+        <w:t>.</w:t>
+      </w:r>
+    </w:p>
+    <w:p>
+      <w:pPr>
+        <w:spacing w:after="80"/>
+        <w:ind w:left="220" w:hanging="220"/>
+      </w:pPr>
+      <w:r>
+        <w:t xml:space="preserve">Zhang et al. ByteTrack: Multi-Object Tracking by Associating Every Detection Box. ECCV, 2022. </w:t>
+      </w:r>
+      <w:hyperlink r:id="rId18">
+        <w:r>
+          <w:rPr>
+            <w:rFonts w:ascii="Times New Roman" w:hAnsi="Times New Roman"/>
+            <w:color w:val="000000"/>
+            <w:sz w:val="22"/>
           </w:rPr>
           <w:t>Paper</w:t>
         </w:r>
@@ -334,94 +379,31 @@
         <w:t>.</w:t>
       </w:r>
     </w:p>
-    <w:p>
-      <w:pPr>
-        <w:spacing w:after="40"/>
-        <w:ind w:left="230" w:hanging="230"/>
-      </w:pPr>
-      <w:r>
-        <w:t xml:space="preserve">4. Aharon, Orfaig, and Bobrovsky. BoT-SORT Robust Associations Multi-Pedestrian Tracking. 2022. </w:t>
-      </w:r>
-      <w:hyperlink r:id="rId15">
-        <w:r>
-          <w:rPr>
-            <w:rFonts w:ascii="Times New Roman" w:hAnsi="Times New Roman"/>
-            <w:color w:val="000000"/>
-            <w:sz w:val="20"/>
-          </w:rPr>
-          <w:t>Paper</w:t>
-        </w:r>
-      </w:hyperlink>
-      <w:r>
-        <w:t>.</w:t>
-      </w:r>
-    </w:p>
-    <w:p>
-      <w:pPr>
-        <w:spacing w:after="40"/>
-        <w:ind w:left="230" w:hanging="230"/>
-      </w:pPr>
-      <w:r>
-        <w:t xml:space="preserve">5. Yang, Fan, and Xu. Video Instance Segmentation. ICCV 2019; YouTube-VIS 2021 dataset and evaluation documentation. </w:t>
-      </w:r>
-      <w:hyperlink r:id="rId16">
-        <w:r>
-          <w:rPr>
-            <w:rFonts w:ascii="Times New Roman" w:hAnsi="Times New Roman"/>
-            <w:color w:val="000000"/>
-            <w:sz w:val="20"/>
-          </w:rPr>
-          <w:t>Dataset</w:t>
-        </w:r>
-      </w:hyperlink>
-      <w:r>
-        <w:t>.</w:t>
-      </w:r>
-    </w:p>
-    <w:p>
-      <w:pPr>
-        <w:spacing w:after="40"/>
-        <w:ind w:left="230" w:hanging="230"/>
-      </w:pPr>
-      <w:r>
-        <w:t xml:space="preserve">6. Luiten et al. HOTA A Higher Order Metric for Evaluating Multi-Object Tracking. IJCV 2020; TrackEval implementation. </w:t>
-      </w:r>
-      <w:hyperlink r:id="rId17">
-        <w:r>
-          <w:rPr>
-            <w:rFonts w:ascii="Times New Roman" w:hAnsi="Times New Roman"/>
-            <w:color w:val="000000"/>
-            <w:sz w:val="20"/>
-          </w:rPr>
-          <w:t>Paper</w:t>
-        </w:r>
-      </w:hyperlink>
-      <w:r>
-        <w:t xml:space="preserve">; </w:t>
-      </w:r>
-      <w:hyperlink r:id="rId18">
-        <w:r>
-          <w:rPr>
-            <w:rFonts w:ascii="Times New Roman" w:hAnsi="Times New Roman"/>
-            <w:color w:val="000000"/>
-            <w:sz w:val="20"/>
-          </w:rPr>
-          <w:t>code</w:t>
-        </w:r>
-      </w:hyperlink>
-      <w:r>
-        <w:t>.</w:t>
-      </w:r>
-    </w:p>
     <w:sectPr>
-      <w:type w:val="continuous"/>
+      <w:headerReference w:type="default" r:id="rId9"/>
       <w:pgSz w:w="12240" w:h="15840"/>
-      <w:pgMar w:top="1080" w:right="1080" w:bottom="1800" w:left="1080" w:header="360" w:footer="360" w:gutter="0"/>
-      <w:cols w:space="540" w:num="2" w:equalWidth="1"/>
+      <w:pgMar w:top="1814" w:right="1800" w:bottom="1786" w:left="1800" w:header="1152" w:footer="360" w:gutter="0"/>
+      <w:cols w:space="720" w:num="1" w:equalWidth="1"/>
       <w:docGrid w:linePitch="360"/>
     </w:sectPr>
   </w:body>
 </w:document>
+</file>
+
+<file path=word/header1.xml><?xml version="1.0" encoding="utf-8"?>
+<w:hdr xmlns:m="http://schemas.openxmlformats.org/officeDocument/2006/math" xmlns:mc="http://schemas.openxmlformats.org/markup-compatibility/2006" xmlns:mo="http://schemas.microsoft.com/office/mac/office/2008/main" xmlns:mv="urn:schemas-microsoft-com:mac:vml" xmlns:o="urn:schemas-microsoft-com:office:office" xmlns:r="http://schemas.openxmlformats.org/officeDocument/2006/relationships" xmlns:v="urn:schemas-microsoft-com:vml" xmlns:w10="urn:schemas-microsoft-com:office:word" xmlns:w14="http://schemas.microsoft.com/office/word/2010/wordml" xmlns:w="http://schemas.openxmlformats.org/wordprocessingml/2006/main" xmlns:wne="http://schemas.microsoft.com/office/word/2006/wordml" xmlns:wp14="http://schemas.microsoft.com/office/word/2010/wordprocessingDrawing" xmlns:wp="http://schemas.openxmlformats.org/drawingml/2006/wordprocessingDrawing" xmlns:wpc="http://schemas.microsoft.com/office/word/2010/wordprocessingCanvas" xmlns:wpg="http://schemas.microsoft.com/office/word/2010/wordprocessingGroup" xmlns:wpi="http://schemas.microsoft.com/office/word/2010/wordprocessingInk" xmlns:wps="http://schemas.microsoft.com/office/word/2010/wordprocessingShape" mc:Ignorable="w14 wp14">
+  <w:p>
+    <w:pPr>
+      <w:pStyle w:val="Header"/>
+    </w:pPr>
+    <w:r>
+      <w:rPr>
+        <w:sz w:val="18"/>
+      </w:rPr>
+      <w:t>CS550 Project Proposal | Fall 2026 | ACML style</w:t>
+    </w:r>
+  </w:p>
+</w:hdr>
 </file>
 
 <file path=word/numbering.xml><?xml version="1.0" encoding="utf-8"?>
@@ -789,12 +771,12 @@
     <w:rsid w:val="00FC693F"/>
     <w:pPr>
       <w:widowControl/>
-      <w:spacing w:before="0" w:after="0" w:lineRule="exact" w:line="240"/>
+      <w:spacing w:before="0" w:after="0" w:lineRule="exact" w:line="272"/>
     </w:pPr>
     <w:rPr>
       <w:rFonts w:ascii="Times New Roman" w:hAnsi="Times New Roman"/>
       <w:color w:val="000000"/>
-      <w:sz w:val="20"/>
+      <w:sz w:val="22"/>
     </w:rPr>
   </w:style>
   <w:style w:type="paragraph" w:styleId="Header">
@@ -852,7 +834,7 @@
     <w:pPr>
       <w:keepNext/>
       <w:keepLines/>
-      <w:spacing w:before="140" w:after="60" w:lineRule="exact" w:line="240"/>
+      <w:spacing w:before="240" w:after="140" w:lineRule="exact" w:line="272"/>
       <w:outlineLvl w:val="0"/>
     </w:pPr>
     <w:rPr>
@@ -860,7 +842,7 @@
       <w:b/>
       <w:bCs/>
       <w:color w:val="000000"/>
-      <w:sz w:val="22"/>
+      <w:sz w:val="24"/>
       <w:szCs w:val="28"/>
     </w:rPr>
   </w:style>
@@ -876,7 +858,7 @@
     <w:pPr>
       <w:keepNext/>
       <w:keepLines/>
-      <w:spacing w:before="0" w:after="0" w:lineRule="exact" w:line="240"/>
+      <w:spacing w:before="0" w:after="0" w:lineRule="exact" w:line="272"/>
       <w:outlineLvl w:val="1"/>
     </w:pPr>
     <w:rPr>
@@ -884,7 +866,7 @@
       <w:b/>
       <w:bCs/>
       <w:color w:val="000000"/>
-      <w:sz w:val="20"/>
+      <w:sz w:val="22"/>
       <w:szCs w:val="26"/>
     </w:rPr>
   </w:style>
@@ -1138,7 +1120,7 @@
     <w:qFormat/>
     <w:rsid w:val="00FC693F"/>
     <w:pPr>
-      <w:spacing w:after="160" w:line="360" w:lineRule="exact" w:before="0"/>
+      <w:spacing w:after="240" w:line="360" w:lineRule="exact" w:before="0"/>
       <w:contextualSpacing/>
     </w:pPr>
     <w:rPr>
@@ -1147,7 +1129,7 @@
       <w:color w:val="000000"/>
       <w:spacing w:val="5"/>
       <w:kern w:val="28"/>
-      <w:sz w:val="32"/>
+      <w:sz w:val="28"/>
       <w:szCs w:val="52"/>
     </w:rPr>
   </w:style>
@@ -1178,7 +1160,7 @@
       <w:numPr>
         <w:ilvl w:val="1"/>
       </w:numPr>
-      <w:spacing w:before="0" w:after="0" w:lineRule="exact" w:line="240"/>
+      <w:spacing w:before="0" w:after="0" w:lineRule="exact" w:line="272"/>
     </w:pPr>
     <w:rPr>
       <w:rFonts w:ascii="Times New Roman" w:hAnsi="Times New Roman"/>
@@ -1186,7 +1168,7 @@
       <w:iCs/>
       <w:color w:val="000000"/>
       <w:spacing w:val="15"/>
-      <w:sz w:val="20"/>
+      <w:sz w:val="22"/>
       <w:szCs w:val="24"/>
     </w:rPr>
   </w:style>

</xml_diff>

<commit_message>
Use the user-provided ACL template for the CS550 proposal
Replace the ACML format with the exact ACL style and bibliography files from the supplied archive. Rebuild the two-page PDF and editable Word companion, add BibTeX references and an Overleaf-ready source package, and update compilation instructions.

Validation: compiled the original ACL style with BibTeX, rendered both pages of the PDF and Word document for visual inspection, and verified the source archive and vendored template hashes.
</commit_message>
<xml_diff>
--- a/output/docx/proposal.docx
+++ b/output/docx/proposal.docx
@@ -12,40 +12,75 @@
       </w:r>
     </w:p>
     <w:p>
+      <w:pPr>
+        <w:jc w:val="center"/>
+      </w:pPr>
       <w:r>
         <w:rPr>
           <w:b/>
+          <w:sz w:val="24"/>
         </w:rPr>
         <w:t>Jingdi Wu</w:t>
       </w:r>
-    </w:p>
-    <w:p>
+      <w:r>
+        <w:rPr>
+          <w:sz w:val="24"/>
+        </w:rPr>
+        <w:t xml:space="preserve"> and </w:t>
+      </w:r>
       <w:r>
         <w:rPr>
           <w:b/>
+          <w:sz w:val="24"/>
         </w:rPr>
         <w:t>Yupu Guo</w:t>
       </w:r>
-    </w:p>
-    <w:p>
+      <w:r>
+        <w:rPr>
+          <w:sz w:val="24"/>
+        </w:rPr>
+        <w:t xml:space="preserve"> and </w:t>
+      </w:r>
       <w:r>
         <w:rPr>
           <w:b/>
+          <w:sz w:val="24"/>
         </w:rPr>
         <w:t>Christina Ross</w:t>
       </w:r>
     </w:p>
     <w:p>
       <w:pPr>
-        <w:spacing w:after="360"/>
+        <w:jc w:val="center"/>
       </w:pPr>
       <w:r>
         <w:rPr>
-          <w:i/>
-          <w:sz w:val="20"/>
+          <w:sz w:val="24"/>
         </w:rPr>
-        <w:t>Rutgers University, CS550 Massive Data Mining</w:t>
+        <w:t>Rutgers University</w:t>
       </w:r>
+    </w:p>
+    <w:p>
+      <w:pPr>
+        <w:spacing w:after="1040"/>
+        <w:jc w:val="center"/>
+      </w:pPr>
+      <w:r>
+        <w:rPr>
+          <w:sz w:val="24"/>
+        </w:rPr>
+        <w:t>CS550 Massive Data Mining, Fall 2026</w:t>
+      </w:r>
+    </w:p>
+    <w:p>
+      <w:pPr>
+        <w:sectPr>
+          <w:pgSz w:w="11906" w:h="16838"/>
+          <w:pgMar w:top="1417" w:right="1417" w:bottom="1417" w:left="1417" w:header="709" w:footer="360" w:gutter="0"/>
+          <w:cols w:space="340" w:num="1" w:equalWidth="1"/>
+          <w:docGrid w:linePitch="360"/>
+        </w:sectPr>
+      </w:pPr>
     </w:p>
     <w:p>
       <w:pPr>
@@ -59,8 +94,8 @@
     </w:p>
     <w:p>
       <w:pPr>
-        <w:spacing w:after="0"/>
-        <w:ind w:left="400" w:right="400"/>
+        <w:spacing w:after="0" w:line="240" w:lineRule="exact"/>
+        <w:ind w:left="340" w:right="340"/>
         <w:jc w:val="both"/>
       </w:pPr>
       <w:r>
@@ -72,28 +107,10 @@
     </w:p>
     <w:p>
       <w:pPr>
-        <w:ind w:left="400" w:right="400"/>
-      </w:pPr>
-      <w:r>
-        <w:rPr>
-          <w:b/>
-          <w:sz w:val="20"/>
-        </w:rPr>
-        <w:t xml:space="preserve">Keywords: </w:t>
-      </w:r>
-      <w:r>
-        <w:rPr>
-          <w:sz w:val="20"/>
-        </w:rPr>
-        <w:t>video instance segmentation; multi-object tracking; fine-tuning; robustness</w:t>
-      </w:r>
-    </w:p>
-    <w:p>
-      <w:pPr>
         <w:pStyle w:val="Heading1"/>
       </w:pPr>
       <w:r>
-        <w:t>1. Introduction</w:t>
+        <w:t>1 Introduction</w:t>
       </w:r>
     </w:p>
     <w:p>
@@ -110,7 +127,7 @@
         <w:pStyle w:val="Heading1"/>
       </w:pPr>
       <w:r>
-        <w:t>2. Methods and Adaptation</w:t>
+        <w:t>2 Methods and Adaptation</w:t>
       </w:r>
     </w:p>
     <w:p>
@@ -125,6 +142,7 @@
     <w:p>
       <w:pPr>
         <w:spacing w:after="0"/>
+        <w:ind w:firstLine="220"/>
         <w:jc w:val="both"/>
       </w:pPr>
       <w:r>
@@ -136,7 +154,7 @@
         <w:pStyle w:val="Heading1"/>
       </w:pPr>
       <w:r>
-        <w:t>3. Data and Experimental Protocol</w:t>
+        <w:t>3 Data and Experimental Protocol</w:t>
       </w:r>
     </w:p>
     <w:p>
@@ -153,7 +171,7 @@
         <w:pStyle w:val="Heading1"/>
       </w:pPr>
       <w:r>
-        <w:t>4. Evaluation and Robustness</w:t>
+        <w:t>4 Evaluation and Robustness</w:t>
       </w:r>
     </w:p>
     <w:p>
@@ -168,6 +186,7 @@
     <w:p>
       <w:pPr>
         <w:spacing w:after="0"/>
+        <w:ind w:firstLine="220"/>
         <w:jc w:val="both"/>
       </w:pPr>
       <w:r>
@@ -179,7 +198,7 @@
         <w:pStyle w:val="Heading1"/>
       </w:pPr>
       <w:r>
-        <w:t>5. Feasibility and Work Plan</w:t>
+        <w:t>5 Feasibility and Work Plan</w:t>
       </w:r>
     </w:p>
     <w:p>
@@ -194,6 +213,7 @@
     <w:p>
       <w:pPr>
         <w:spacing w:after="0"/>
+        <w:ind w:firstLine="220"/>
         <w:jc w:val="both"/>
       </w:pPr>
       <w:r>
@@ -214,7 +234,29 @@
         <w:ind w:left="220" w:hanging="220"/>
       </w:pPr>
       <w:r>
-        <w:t xml:space="preserve">Aharon, Orfaig, and Bobrovsky. BoT-SORT: Robust Associations Multi-Pedestrian Tracking. 2022. </w:t>
+        <w:t xml:space="preserve">Nir Aharon, Roy Orfaig, and Ben-Zion Bobrovsky. 2022. </w:t>
+      </w:r>
+      <w:hyperlink r:id="rId9">
+        <w:r>
+          <w:rPr>
+            <w:rFonts w:ascii="Times New Roman" w:hAnsi="Times New Roman"/>
+            <w:color w:val="000000"/>
+            <w:sz w:val="22"/>
+          </w:rPr>
+          <w:t>BoT-SORT: Robust associations multi-pedestrian tracking</w:t>
+        </w:r>
+      </w:hyperlink>
+      <w:r>
+        <w:t>. arXiv:2206.14651.</w:t>
+      </w:r>
+    </w:p>
+    <w:p>
+      <w:pPr>
+        <w:spacing w:after="80"/>
+        <w:ind w:left="220" w:hanging="220"/>
+      </w:pPr>
+      <w:r>
+        <w:t xml:space="preserve">Jonathon Luiten, Aljosa Osep, Patrick Dendorfer, Philip Torr, Andreas Geiger, Laura Leal-Taixe, and Bastian Leibe. 2020. </w:t>
       </w:r>
       <w:hyperlink r:id="rId10">
         <w:r>
@@ -223,11 +265,11 @@
             <w:color w:val="000000"/>
             <w:sz w:val="22"/>
           </w:rPr>
-          <w:t>Paper</w:t>
+          <w:t>HOTA: A higher order metric for evaluating multi-object tracking</w:t>
         </w:r>
       </w:hyperlink>
       <w:r>
-        <w:t>.</w:t>
+        <w:t>. International Journal of Computer Vision.</w:t>
       </w:r>
     </w:p>
     <w:p>
@@ -236,7 +278,7 @@
         <w:ind w:left="220" w:hanging="220"/>
       </w:pPr>
       <w:r>
-        <w:t xml:space="preserve">Luiten et al. HOTA: A Higher Order Metric for Evaluating Multi-Object Tracking. IJCV, 2020. </w:t>
+        <w:t xml:space="preserve">Meta AI. 2026. </w:t>
       </w:r>
       <w:hyperlink r:id="rId11">
         <w:r>
@@ -245,11 +287,20 @@
             <w:color w:val="000000"/>
             <w:sz w:val="22"/>
           </w:rPr>
-          <w:t>Paper</w:t>
+          <w:t>SAM 3: Model and training documentation</w:t>
         </w:r>
       </w:hyperlink>
       <w:r>
-        <w:t xml:space="preserve">; </w:t>
+        <w:t>. Online documentation, accessed October 7, 2026.</w:t>
+      </w:r>
+    </w:p>
+    <w:p>
+      <w:pPr>
+        <w:spacing w:after="80"/>
+        <w:ind w:left="220" w:hanging="220"/>
+      </w:pPr>
+      <w:r>
+        <w:t xml:space="preserve">Ultralytics. 2026. </w:t>
       </w:r>
       <w:hyperlink r:id="rId12">
         <w:r>
@@ -258,11 +309,11 @@
             <w:color w:val="000000"/>
             <w:sz w:val="22"/>
           </w:rPr>
-          <w:t>implementation</w:t>
+          <w:t>Instance segmentation and multi-object tracking documentation</w:t>
         </w:r>
       </w:hyperlink>
       <w:r>
-        <w:t>.</w:t>
+        <w:t>. Online documentation, accessed October 7, 2026.</w:t>
       </w:r>
     </w:p>
     <w:p>
@@ -271,7 +322,7 @@
         <w:ind w:left="220" w:hanging="220"/>
       </w:pPr>
       <w:r>
-        <w:t xml:space="preserve">Meta AI. SAM 3 model and training documentation. 2026. </w:t>
+        <w:t xml:space="preserve">Linjie Yang, Yuchen Fan, and Ning Xu. 2019. </w:t>
       </w:r>
       <w:hyperlink r:id="rId13">
         <w:r>
@@ -280,11 +331,20 @@
             <w:color w:val="000000"/>
             <w:sz w:val="22"/>
           </w:rPr>
-          <w:t>Repository</w:t>
+          <w:t>Video instance segmentation</w:t>
         </w:r>
       </w:hyperlink>
       <w:r>
-        <w:t xml:space="preserve">; </w:t>
+        <w:t>. In Proceedings of the IEEE/CVF International Conference on Computer Vision.</w:t>
+      </w:r>
+    </w:p>
+    <w:p>
+      <w:pPr>
+        <w:spacing w:after="80"/>
+        <w:ind w:left="220" w:hanging="220"/>
+      </w:pPr>
+      <w:r>
+        <w:t xml:space="preserve">Yifu Zhang, Peize Sun, Yi Jiang, Dongdong Yu, Fucheng Weng, Zehuan Yuan, Ping Luo, Wenyu Liu, and Xinggang Wang. 2022. </w:t>
       </w:r>
       <w:hyperlink r:id="rId14">
         <w:r>
@@ -293,117 +353,22 @@
             <w:color w:val="000000"/>
             <w:sz w:val="22"/>
           </w:rPr>
-          <w:t>training guide</w:t>
+          <w:t>ByteTrack: Multi-object tracking by associating every detection box</w:t>
         </w:r>
       </w:hyperlink>
       <w:r>
-        <w:t>.</w:t>
-      </w:r>
-    </w:p>
-    <w:p>
-      <w:pPr>
-        <w:spacing w:after="80"/>
-        <w:ind w:left="220" w:hanging="220"/>
-      </w:pPr>
-      <w:r>
-        <w:t xml:space="preserve">Ultralytics. Segmentation and tracking documentation. 2026. </w:t>
-      </w:r>
-      <w:hyperlink r:id="rId15">
-        <w:r>
-          <w:rPr>
-            <w:rFonts w:ascii="Times New Roman" w:hAnsi="Times New Roman"/>
-            <w:color w:val="000000"/>
-            <w:sz w:val="22"/>
-          </w:rPr>
-          <w:t>Segmentation</w:t>
-        </w:r>
-      </w:hyperlink>
-      <w:r>
-        <w:t xml:space="preserve">; </w:t>
-      </w:r>
-      <w:hyperlink r:id="rId16">
-        <w:r>
-          <w:rPr>
-            <w:rFonts w:ascii="Times New Roman" w:hAnsi="Times New Roman"/>
-            <w:color w:val="000000"/>
-            <w:sz w:val="22"/>
-          </w:rPr>
-          <w:t>tracking</w:t>
-        </w:r>
-      </w:hyperlink>
-      <w:r>
-        <w:t>.</w:t>
-      </w:r>
-    </w:p>
-    <w:p>
-      <w:pPr>
-        <w:spacing w:after="80"/>
-        <w:ind w:left="220" w:hanging="220"/>
-      </w:pPr>
-      <w:r>
-        <w:t xml:space="preserve">Yang, Fan, and Xu. Video Instance Segmentation. ICCV, 2019. </w:t>
-      </w:r>
-      <w:hyperlink r:id="rId17">
-        <w:r>
-          <w:rPr>
-            <w:rFonts w:ascii="Times New Roman" w:hAnsi="Times New Roman"/>
-            <w:color w:val="000000"/>
-            <w:sz w:val="22"/>
-          </w:rPr>
-          <w:t>YouTube-VIS dataset</w:t>
-        </w:r>
-      </w:hyperlink>
-      <w:r>
-        <w:t>.</w:t>
-      </w:r>
-    </w:p>
-    <w:p>
-      <w:pPr>
-        <w:spacing w:after="80"/>
-        <w:ind w:left="220" w:hanging="220"/>
-      </w:pPr>
-      <w:r>
-        <w:t xml:space="preserve">Zhang et al. ByteTrack: Multi-Object Tracking by Associating Every Detection Box. ECCV, 2022. </w:t>
-      </w:r>
-      <w:hyperlink r:id="rId18">
-        <w:r>
-          <w:rPr>
-            <w:rFonts w:ascii="Times New Roman" w:hAnsi="Times New Roman"/>
-            <w:color w:val="000000"/>
-            <w:sz w:val="22"/>
-          </w:rPr>
-          <w:t>Paper</w:t>
-        </w:r>
-      </w:hyperlink>
-      <w:r>
-        <w:t>.</w:t>
+        <w:t>. In European Conference on Computer Vision.</w:t>
       </w:r>
     </w:p>
     <w:sectPr>
-      <w:headerReference w:type="default" r:id="rId9"/>
-      <w:pgSz w:w="12240" w:h="15840"/>
-      <w:pgMar w:top="1814" w:right="1800" w:bottom="1786" w:left="1800" w:header="1152" w:footer="360" w:gutter="0"/>
-      <w:cols w:space="720" w:num="1" w:equalWidth="1"/>
+      <w:type w:val="continuous"/>
+      <w:pgSz w:w="11906" w:h="16838"/>
+      <w:pgMar w:top="1417" w:right="1417" w:bottom="1417" w:left="1417" w:header="709" w:footer="360" w:gutter="0"/>
+      <w:cols w:space="340" w:num="2" w:equalWidth="1"/>
       <w:docGrid w:linePitch="360"/>
     </w:sectPr>
   </w:body>
 </w:document>
-</file>
-
-<file path=word/header1.xml><?xml version="1.0" encoding="utf-8"?>
-<w:hdr xmlns:m="http://schemas.openxmlformats.org/officeDocument/2006/math" xmlns:mc="http://schemas.openxmlformats.org/markup-compatibility/2006" xmlns:mo="http://schemas.microsoft.com/office/mac/office/2008/main" xmlns:mv="urn:schemas-microsoft-com:mac:vml" xmlns:o="urn:schemas-microsoft-com:office:office" xmlns:r="http://schemas.openxmlformats.org/officeDocument/2006/relationships" xmlns:v="urn:schemas-microsoft-com:vml" xmlns:w10="urn:schemas-microsoft-com:office:word" xmlns:w14="http://schemas.microsoft.com/office/word/2010/wordml" xmlns:w="http://schemas.openxmlformats.org/wordprocessingml/2006/main" xmlns:wne="http://schemas.microsoft.com/office/word/2006/wordml" xmlns:wp14="http://schemas.microsoft.com/office/word/2010/wordprocessingDrawing" xmlns:wp="http://schemas.openxmlformats.org/drawingml/2006/wordprocessingDrawing" xmlns:wpc="http://schemas.microsoft.com/office/word/2010/wordprocessingCanvas" xmlns:wpg="http://schemas.microsoft.com/office/word/2010/wordprocessingGroup" xmlns:wpi="http://schemas.microsoft.com/office/word/2010/wordprocessingInk" xmlns:wps="http://schemas.microsoft.com/office/word/2010/wordprocessingShape" mc:Ignorable="w14 wp14">
-  <w:p>
-    <w:pPr>
-      <w:pStyle w:val="Header"/>
-    </w:pPr>
-    <w:r>
-      <w:rPr>
-        <w:sz w:val="18"/>
-      </w:rPr>
-      <w:t>CS550 Project Proposal | Fall 2026 | ACML style</w:t>
-    </w:r>
-  </w:p>
-</w:hdr>
 </file>
 
 <file path=word/numbering.xml><?xml version="1.0" encoding="utf-8"?>
@@ -834,7 +799,7 @@
     <w:pPr>
       <w:keepNext/>
       <w:keepLines/>
-      <w:spacing w:before="240" w:after="140" w:lineRule="exact" w:line="272"/>
+      <w:spacing w:before="200" w:after="140" w:lineRule="exact" w:line="272"/>
       <w:outlineLvl w:val="0"/>
     </w:pPr>
     <w:rPr>
@@ -1120,7 +1085,7 @@
     <w:qFormat/>
     <w:rsid w:val="00FC693F"/>
     <w:pPr>
-      <w:spacing w:after="240" w:line="360" w:lineRule="exact" w:before="0"/>
+      <w:spacing w:after="288" w:line="320" w:lineRule="exact" w:before="180"/>
       <w:contextualSpacing/>
     </w:pPr>
     <w:rPr>

</xml_diff>

<commit_message>
Keep proposal materials and expand the MOTS comparison plan
Remove the starter implementation, experiment configuration, tests, CI, and extra planning documents. Revise the two-page ACL proposal to cover YOLO with both trackers, SAM 2.1, SAM-Track, and OpenCV MOG2/KNN, including neural adaptation and parameter tuning. Specify automatic initialization, sequence-disjoint evaluation, MOTS metrics, and compute-dependent training scope.

Validation: compiled with the original ACL template and resolved all eight citations; visually inspected both PDF and Word pages; verified the source package and original template bytes. Deleted task-created temporary files. No models were executed and no numerical benchmark results are claimed.
</commit_message>
<xml_diff>
--- a/output/docx/proposal.docx
+++ b/output/docx/proposal.docx
@@ -8,7 +8,7 @@
         <w:jc w:val="center"/>
       </w:pPr>
       <w:r>
-        <w:t>Robust Multi-Object Segmentation and Tracking</w:t>
+        <w:t>Evaluating Multi Object Segmentation and Tracking</w:t>
       </w:r>
     </w:p>
     <w:p>
@@ -102,7 +102,7 @@
         <w:rPr>
           <w:sz w:val="20"/>
         </w:rPr>
-        <w:t>We compare automatic segmentation and tracking across people, animals, and vehicles using SAM 3 and YOLO with ByteTrack or BoT-SORT. We test whether adaptation improves mask accuracy, identity continuity, and robustness on annotated, sequence-disjoint videos. SAM 3 image-stage fine-tuning requires a GPU and mask-training pilot; YOLO adaptation provides a fallback. Deliverables are reproducible code, an eight-page report excluding references, and a presentation.</w:t>
+        <w:t>We propose to compare four families of video instance segmentation and tracking methods across people, animals, and vehicles: YOLO segmentation with ByteTrack or BoT-SORT, SAM 2.1, SAM-Track, and OpenCV background subtraction. We will evaluate pretrained and adapted variants using mask accuracy, identity association, robustness, and computational cost. The study distinguishes neural fine-tuning from configuration and background adaptation. Deliverables are a reproducible comparison and an eight-page final report excluding references.</w:t>
       </w:r>
     </w:p>
     <w:p>
@@ -110,7 +110,7 @@
         <w:pStyle w:val="Heading1"/>
       </w:pPr>
       <w:r>
-        <w:t>1 Introduction</w:t>
+        <w:t>1 Research Questions</w:t>
       </w:r>
     </w:p>
     <w:p>
@@ -119,7 +119,7 @@
         <w:jc w:val="both"/>
       </w:pPr>
       <w:r>
-        <w:t>Accurate masks do not ensure identity continuity through motion or occlusion. We ask how methods trade accuracy, association, and computation; whether adaptation improves unseen-video performance; and how degradation affects these measures. We hypothesize that adaptation improves masks while association may remain a bottleneck.</w:t>
+        <w:t>Accurate outlines do not guarantee consistent identities through motion, occlusion, or reappearance. We ask which pipelines best balance segmentation, detection, and association; whether fine-tuning improves unseen-video performance; and how camera motion and image degradation affect these results. Vehicles are one example among several categories. Tracking annotated objects does not itself identify physical motion relative to the world.</w:t>
       </w:r>
     </w:p>
     <w:p>
@@ -136,7 +136,7 @@
         <w:jc w:val="both"/>
       </w:pPr>
       <w:r>
-        <w:t>SAM 3 tracks instances matching a text concept (Meta AI, 2026). Baselines use YOLO11s-seg with ByteTrack or BoT-SORT (Ultralytics, 2026; Zhang et al., 2022; Aharon et al., 2022). Each outputs masks, categories, confidence, and IDs. SAM 3 uses fixed prompts without manual corrections; separate concept runs use namespaced IDs and validation-selected conflict handling. Timing includes every run.</w:t>
+        <w:t>We will evaluate YOLO11s-seg with ByteTrack and BoT-SORT separately (Ultralytics, 2026); SAM 2.1 with temporal memory (Meta AI, 2026); SAM-Track using SAM keyframe masks and DeAOT propagation with periodic discovery (Cheng et al., 2023); and MOG2 and KNN as separate OpenCV baselines (OpenCV, 2026). Background masks require instance separation and a fixed association algorithm to obtain IDs.</w:t>
       </w:r>
     </w:p>
     <w:p>
@@ -146,41 +146,7 @@
         <w:jc w:val="both"/>
       </w:pPr>
       <w:r>
-        <w:t>If feasible, we adapt SAM 3's image detector and shared features, holding its tracker fixed. Its example configuration disables segmentation; mask supervision and checkpoint transfer must be verified. Otherwise, we fine-tune YOLO with both trackers, retaining pretrained SAM 3 when inference fits. Threshold selection is configuration tuning. Custom LoRA and tracker training are outside scope.</w:t>
-      </w:r>
-    </w:p>
-    <w:p>
-      <w:pPr>
-        <w:pStyle w:val="Heading1"/>
-      </w:pPr>
-      <w:r>
-        <w:t>3 Data and Experimental Protocol</w:t>
-      </w:r>
-    </w:p>
-    <w:p>
-      <w:pPr>
-        <w:spacing w:after="0"/>
-        <w:jc w:val="both"/>
-      </w:pPr>
-      <w:r>
-        <w:t>We target up to 200 labeled YouTube-VIS 2021 training videos covering person, dog, cat, horse, and car (Yang et al., 2019), split 60/20/20 by complete source video with category coverage. Training uses sampled frames and masks; evaluation retains annotated sequences. We freeze splits, category mappings, prompts, checkpoints, preprocessing, and tracker settings. Test annotations serve only scoring; annotation limitations and known pretraining overlap will be disclosed.</w:t>
-      </w:r>
-    </w:p>
-    <w:p>
-      <w:pPr>
-        <w:pStyle w:val="Heading1"/>
-      </w:pPr>
-      <w:r>
-        <w:t>4 Evaluation and Robustness</w:t>
-      </w:r>
-    </w:p>
-    <w:p>
-      <w:pPr>
-        <w:spacing w:after="0"/>
-        <w:jc w:val="both"/>
-      </w:pPr>
-      <w:r>
-        <w:t>Primary evaluation is held-out video AP using the official YouTube-VIS evaluator. Frame mask AP diagnoses segmentation. Supplementary mask HOTA, DetA, AssA, and ID switches require validated annotation conversion and matching (Luiten et al., 2020). These are internal subset results. Validation fixes track-confidence aggregation.</w:t>
+        <w:t>Automatic SAM pipelines will use one frozen YOLO detector for box prompts, category labels, and new-object initialization at a validation-selected interval. The same detector will label and help separate foreground components for OpenCV; mask-IoU association will link its instances. These are detector-assisted pipelines, and runtime includes this dependency. YOLO retains native detection and association. No automatic run receives test ground-truth prompts or detector tracking IDs. Any ground-truth-initialized propagation study will be reported separately.</w:t>
       </w:r>
     </w:p>
     <w:p>
@@ -190,7 +156,7 @@
         <w:jc w:val="both"/>
       </w:pPr>
       <w:r>
-        <w:t>Paired blur, brightness, and JPEG tests preserve geometry. We report score drops, identity continuity, occlusion failures, FPS, and peak GPU memory, recording hardware, precision, resolutions, and timing scope. Uncertainty resamples videos; repeated seeds depend on budget. Adjacent-mask overlap cannot measure stability because objects move.</w:t>
+        <w:t>We plan pretrained-versus-fine-tuned pairs for YOLO's segmenter, SAM 2.1, and SAM-Track's DeAOT component, keeping SAM fixed for the latter (Yang and Yang, 2022). YOLO adaptation is required; SAM 2.1 and DeAOT training depend on GPU pilots and custom-data integration. OpenCV receives validation-tuned thresholds, history, and learning rates, with online background updates. These updates and tracker/discovery parameter tuning are not neural fine-tuning. Each weight comparison holds prompts, detector, association settings, and preprocessing fixed where applicable.</w:t>
       </w:r>
     </w:p>
     <w:p>
@@ -198,7 +164,7 @@
         <w:pStyle w:val="Heading1"/>
       </w:pPr>
       <w:r>
-        <w:t>5 Feasibility and Work Plan</w:t>
+        <w:t>3 Data and Fair Evaluation</w:t>
       </w:r>
     </w:p>
     <w:p>
@@ -207,7 +173,7 @@
         <w:jc w:val="both"/>
       </w:pPr>
       <w:r>
-        <w:t>Hardware is unconfirmed. SAM 3 supports single-GPU image-stage training without a universal memory guarantee. A 100-frame inference and 20-step mask-training pilot at batch size one must verify memory headroom, finite gradients, changed intended parameters, and reloaded weights. Measured throughput sets the training budget.</w:t>
+        <w:t>We target up to 200 labeled YouTube-VIS 2021 training videos containing person, dog, cat, horse, and car, split 60/20/20 by complete source video with category coverage (Yang et al., 2021). YOLO uses sampled mask-labeled images; temporal models require annotated clips. Methods process the same frozen timeline. We document target classes, annotation coverage, pretraining overlap, and fixed-versus-moving-camera strata. Moving-camera results are a stress test for background subtraction. Training and configuration selection use only training and validation videos.</w:t>
       </w:r>
     </w:p>
     <w:p>
@@ -217,7 +183,61 @@
         <w:jc w:val="both"/>
       </w:pPr>
       <w:r>
-        <w:t>Weeks 1-2 establish data, baselines, and evaluation; weeks 3-4 cover the pilot and adaptation; week 5 runs frozen held-out comparisons; week 6 analyzes robustness; weeks 7-8 prepare the report and presentation. YOLO fallback begins by week 3. Improvement claims require measured evidence.</w:t>
+        <w:t>Predictions contain original-resolution masks, categories, and persistent IDs. We validate category mapping, absent frames, ignore handling, and a shared overlap-resolution rule before annotation conversion. Results are an internal subset comparison, not official leaderboard scores.</w:t>
+      </w:r>
+    </w:p>
+    <w:p>
+      <w:pPr>
+        <w:pStyle w:val="Heading1"/>
+      </w:pPr>
+      <w:r>
+        <w:t>4 Metrics and Robustness</w:t>
+      </w:r>
+    </w:p>
+    <w:p>
+      <w:pPr>
+        <w:spacing w:after="0"/>
+        <w:jc w:val="both"/>
+      </w:pPr>
+      <w:r>
+        <w:t>Primary measures are sMOTSA and mask-based HOTA with DetA and AssA (Voigtlaender et al., 2019; Luiten et al., 2020). sMOTSA rewards matched-mask IoU while penalizing false positives and identity switches; HOTA separates detection and association quality. Diagnostics include MOTSA, MOTSP, mask-matched IDF1, ID switches, and false positives/negatives. MOTSP describes matched masks only. MOTS matching uses mask IoU greater than 0.5 and non-overlapping instances; HOTA uses its standard threshold sweep. We will validate a multicategory adapter rather than reuse a car/pedestrian-only loader unchanged. These are MOTS-style metrics on YouTube-VIS; native video AP is supplementary.</w:t>
+      </w:r>
+    </w:p>
+    <w:p>
+      <w:pPr>
+        <w:spacing w:after="0"/>
+        <w:ind w:firstLine="220"/>
+        <w:jc w:val="both"/>
+      </w:pPr>
+      <w:r>
+        <w:t>Paired blur, brightness, and JPEG tests preserve ground-truth geometry. We compare score drops, occlusion failures, FPS, peak GPU memory, and training time. Video-level bootstrap intervals quantify uncertainty where feasible. Timing includes prompting, discovery, and postprocessing. Adjacent-frame mask overlap alone cannot measure stability because objects move.</w:t>
+      </w:r>
+    </w:p>
+    <w:p>
+      <w:pPr>
+        <w:pStyle w:val="Heading1"/>
+      </w:pPr>
+      <w:r>
+        <w:t>5 Feasibility and Schedule</w:t>
+      </w:r>
+    </w:p>
+    <w:p>
+      <w:pPr>
+        <w:spacing w:after="0"/>
+        <w:jc w:val="both"/>
+      </w:pPr>
+      <w:r>
+        <w:t>GPU access is unconfirmed. Each neural candidate receives a 100-frame inference and 20-step training pilot to check memory, gradients, checkpoint reloads, and projected GPU hours. We start with smaller checkpoints and explicit trainable components. Inference and training failures will be documented, with pretrained-only comparisons where inference fits.</w:t>
+      </w:r>
+    </w:p>
+    <w:p>
+      <w:pPr>
+        <w:spacing w:after="0"/>
+        <w:ind w:firstLine="220"/>
+        <w:jc w:val="both"/>
+      </w:pPr>
+      <w:r>
+        <w:t>Weeks 1-2 establish data, adapters, and baseline families; weeks 3-4 cover tuning and feasible neural adaptation; weeks 5-6 run frozen evaluations and robustness tests; weeks 7-8 complete analysis, the eight-page report, and presentation. Deliverables include method-by-metric tables, adaptation differences, failure sequences, and reproducible manifests.</w:t>
       </w:r>
     </w:p>
     <w:p>
@@ -234,7 +254,7 @@
         <w:ind w:left="220" w:hanging="220"/>
       </w:pPr>
       <w:r>
-        <w:t xml:space="preserve">Nir Aharon, Roy Orfaig, and Ben-Zion Bobrovsky. 2022. </w:t>
+        <w:t xml:space="preserve">Yangming Cheng, Liulei Li, Yuanyou Xu, Xiaodi Li, Zongxin Yang, Wenguan Wang, and Yi Yang. 2023. </w:t>
       </w:r>
       <w:hyperlink r:id="rId9">
         <w:r>
@@ -243,11 +263,11 @@
             <w:color w:val="000000"/>
             <w:sz w:val="22"/>
           </w:rPr>
-          <w:t>BoT-SORT: Robust associations multi-pedestrian tracking</w:t>
+          <w:t>Segment and track anything</w:t>
         </w:r>
       </w:hyperlink>
       <w:r>
-        <w:t>. arXiv:2206.14651.</w:t>
+        <w:t>. arXiv:2305.06558.</w:t>
       </w:r>
     </w:p>
     <w:p>
@@ -287,7 +307,29 @@
             <w:color w:val="000000"/>
             <w:sz w:val="22"/>
           </w:rPr>
-          <w:t>SAM 3: Model and training documentation</w:t>
+          <w:t>SAM 2 and SAM 2.1 training documentation</w:t>
+        </w:r>
+      </w:hyperlink>
+      <w:r>
+        <w:t>. Online documentation, accessed October 7, 2026.</w:t>
+      </w:r>
+    </w:p>
+    <w:p>
+      <w:pPr>
+        <w:spacing w:after="80"/>
+        <w:ind w:left="220" w:hanging="220"/>
+      </w:pPr>
+      <w:r>
+        <w:t xml:space="preserve">OpenCV. 2026. </w:t>
+      </w:r>
+      <w:hyperlink r:id="rId12">
+        <w:r>
+          <w:rPr>
+            <w:rFonts w:ascii="Times New Roman" w:hAnsi="Times New Roman"/>
+            <w:color w:val="000000"/>
+            <w:sz w:val="22"/>
+          </w:rPr>
+          <w:t>Background subtraction</w:t>
         </w:r>
       </w:hyperlink>
       <w:r>
@@ -302,7 +344,7 @@
       <w:r>
         <w:t xml:space="preserve">Ultralytics. 2026. </w:t>
       </w:r>
-      <w:hyperlink r:id="rId12">
+      <w:hyperlink r:id="rId13">
         <w:r>
           <w:rPr>
             <w:rFonts w:ascii="Times New Roman" w:hAnsi="Times New Roman"/>
@@ -322,20 +364,20 @@
         <w:ind w:left="220" w:hanging="220"/>
       </w:pPr>
       <w:r>
-        <w:t xml:space="preserve">Linjie Yang, Yuchen Fan, and Ning Xu. 2019. </w:t>
+        <w:t xml:space="preserve">Paul Voigtlaender, Michael Krause, Aljosa Osep, Jonathon Luiten, Berin Balachandar Gnana Sekar, Andreas Geiger, and Bastian Leibe. 2019. </w:t>
       </w:r>
-      <w:hyperlink r:id="rId13">
+      <w:hyperlink r:id="rId14">
         <w:r>
           <w:rPr>
             <w:rFonts w:ascii="Times New Roman" w:hAnsi="Times New Roman"/>
             <w:color w:val="000000"/>
             <w:sz w:val="22"/>
           </w:rPr>
-          <w:t>Video instance segmentation</w:t>
+          <w:t>MOTS: Multi-object tracking and segmentation</w:t>
         </w:r>
       </w:hyperlink>
       <w:r>
-        <w:t>. In Proceedings of the IEEE/CVF International Conference on Computer Vision.</w:t>
+        <w:t>. In CVPR.</w:t>
       </w:r>
     </w:p>
     <w:p>
@@ -344,20 +386,42 @@
         <w:ind w:left="220" w:hanging="220"/>
       </w:pPr>
       <w:r>
-        <w:t xml:space="preserve">Yifu Zhang, Peize Sun, Yi Jiang, Dongdong Yu, Fucheng Weng, Zehuan Yuan, Ping Luo, Wenyu Liu, and Xinggang Wang. 2022. </w:t>
+        <w:t xml:space="preserve">Linjie Yang, Yuchen Fan, Yang Fu, and Ning Xu. 2021. </w:t>
       </w:r>
-      <w:hyperlink r:id="rId14">
+      <w:hyperlink r:id="rId15">
         <w:r>
           <w:rPr>
             <w:rFonts w:ascii="Times New Roman" w:hAnsi="Times New Roman"/>
             <w:color w:val="000000"/>
             <w:sz w:val="22"/>
           </w:rPr>
-          <w:t>ByteTrack: Multi-object tracking by associating every detection box</w:t>
+          <w:t>The 3rd Large-scale Video Object Segmentation Challenge - video instance segmentation track</w:t>
         </w:r>
       </w:hyperlink>
       <w:r>
-        <w:t>. In European Conference on Computer Vision.</w:t>
+        <w:t>.</w:t>
+      </w:r>
+    </w:p>
+    <w:p>
+      <w:pPr>
+        <w:spacing w:after="80"/>
+        <w:ind w:left="220" w:hanging="220"/>
+      </w:pPr>
+      <w:r>
+        <w:t xml:space="preserve">Zongxin Yang and Yi Yang. 2022. </w:t>
+      </w:r>
+      <w:hyperlink r:id="rId16">
+        <w:r>
+          <w:rPr>
+            <w:rFonts w:ascii="Times New Roman" w:hAnsi="Times New Roman"/>
+            <w:color w:val="000000"/>
+            <w:sz w:val="22"/>
+          </w:rPr>
+          <w:t>Decoupling features in hierarchical propagation for video object segmentation</w:t>
+        </w:r>
+      </w:hyperlink>
+      <w:r>
+        <w:t>. In NeurIPS.</w:t>
       </w:r>
     </w:p>
     <w:sectPr>

</xml_diff>